<commit_message>
Adapt README and report to telemedicine topic 19
</commit_message>
<xml_diff>
--- a/REPORT.docx
+++ b/REPORT.docx
@@ -19,7 +19,7 @@
         <w:rPr>
           <w:b/>
         </w:rPr>
-        <w:t>Assem Tugelbay  |  SE-2540  |  Online Banking</w:t>
+        <w:t>Assem Tugelbay  |  SE-2540  |  Topic 19: Telemedicine</w:t>
       </w:r>
     </w:p>
     <w:p>
@@ -32,7 +32,7 @@
     </w:p>
     <w:p>
       <w:r>
-        <w:t>The application models one bank transfer as a three-stage operation. The client calls one facade, while Account Ledger, Compliance Checker and Settlement Confirmer perform independent steps A, B and C. State is saved in CSV files so it survives a restart.</w:t>
+        <w:t>The application books one telemedicine consultation as a three-stage operation. The client calls one facade, while Appointment Scheduler/Patient Record, Video Call Manager/Session Notes and E-Prescription/Billing perform independent steps A, B and C. State is saved in CSV files so it survives a restart.</w:t>
       </w:r>
     </w:p>
     <w:p>
@@ -45,7 +45,7 @@
     </w:p>
     <w:p>
       <w:r>
-        <w:t>BankingFacade validates the request, runs A to B to C, writes a chain record after each committed step and compensates the correct portion after a failure. OperationsFacade is a narrower administrative facade for inspection, manual compensation and reset. Each subsystem contains an entity, business logic service and persistence gateway. The subsystems never import one another.</w:t>
+        <w:t>The telemedicine facade validates the request, runs A to B to C, writes a chain record after each committed step and compensates the correct portion after a failure. OperationsFacade is a narrower administrative facade for inspection, manual compensation and reset. Each subsystem contains an entity, business logic service and persistence gateway. The subsystems never import one another.</w:t>
       </w:r>
     </w:p>
     <w:p>
@@ -58,12 +58,12 @@
     </w:p>
     <w:p>
       <w:r>
-        <w:t>B failure: A has reserved funds and the saved stage is PENDING_B. The facade releases A and stores COMPENSATED_A.</w:t>
+        <w:t>B failure: A has held the appointment slot and the saved stage is PENDING_B. The facade releases the slot and stores COMPENSATED_A.</w:t>
       </w:r>
     </w:p>
     <w:p>
       <w:r>
-        <w:t>C failure: A is reserved and B is approved, so the saved stage is PENDING_C. The facade cancels B first, releases A second, and stores COMPENSATED_B_A.</w:t>
+        <w:t>C failure: A is held and B has saved session notes, so the saved stage is PENDING_C. The facade cancels the video session first, releases the slot second, and stores COMPENSATED_B_A.</w:t>
       </w:r>
     </w:p>
     <w:p>
@@ -76,7 +76,7 @@
     </w:p>
     <w:p>
       <w:r>
-        <w:t>The files accounts.csv, compliance.csv, settlements.csv and chain.csv are the durable state. The tests use a new temporary directory for every test. They cover the happy path, both compensation depths, a restart in PENDING_B, invalid input, direct subsystem use and the administrative facade. JaCoCo is configured with an 80 percent line coverage check in the coverage profile.</w:t>
+        <w:t>The files accounts.csv, compliance.csv, settlements.csv and chain.csv are the durable state. The tests use a new temporary directory for every test. They cover successful booking, both compensation depths, a restart in PENDING_B, invalid input, direct subsystem use and the administrative facade. JaCoCo is configured with an 80 percent line coverage check in the coverage profile.</w:t>
       </w:r>
     </w:p>
     <w:p>
@@ -107,7 +107,7 @@
     </w:p>
     <w:p>
       <w:r>
-        <w:t>Use 1 for success, 2 for B failure, 3 for C failure, 4 to inspect state, 5 then restart and 6 to resume, and 8 to reset the store.</w:t>
+        <w:t>Use 1 to book a consultation, 2 for a video-call failure, 3 for an e-prescription or billing failure, 4 to inspect state, 5 then restart and 6 to resume, and 8 to reset the store.</w:t>
       </w:r>
     </w:p>
     <w:sectPr>

</xml_diff>